<commit_message>
Strengthen resume with verified data validation and automation work
</commit_message>
<xml_diff>
--- a/ats/ATS_Data_Engineering_Resume.docx
+++ b/ats/ATS_Data_Engineering_Resume.docx
@@ -62,10 +62,10 @@
         <w:rPr>
           <w:b/>
         </w:rPr>
-        <w:t xml:space="preserve">Data pipelines: </w:t>
+        <w:t xml:space="preserve">Data pipelines and storage: </w:t>
       </w:r>
       <w:r>
-        <w:t>Stream ingestion, batch preprocessing, extract-transform-export workflows, time-series alignment, event labels, feature engineering, CSV, JSON, XDF.</w:t>
+        <w:t>Stream ingestion, batch ETL-style processing, structured CSV datasets, JSON metadata, XDF recordings, time-series alignment, feature engineering.</w:t>
       </w:r>
     </w:p>
     <w:p>
@@ -73,10 +73,10 @@
         <w:rPr>
           <w:b/>
         </w:rPr>
-        <w:t xml:space="preserve">Reliability and reproducibility: </w:t>
+        <w:t xml:space="preserve">Validation and automation: </w:t>
       </w:r>
       <w:r>
-        <w:t>Preprocessing manifests, session metadata, diagnostic logs, stream discovery, configuration-driven workflows, held-session-out evaluation, Git.</w:t>
+        <w:t>Schema checks, empty-dataset rejection, channel validation, automated unit tests, preprocessing manifests, scripted orchestration, diagnostic logging, Git.</w:t>
       </w:r>
     </w:p>
     <w:p>
@@ -116,7 +116,7 @@
         <w:pStyle w:val="ListBullet"/>
       </w:pPr>
       <w:r>
-        <w:t>Built a Python workflow connecting CGX EEG streams and five-state visual-stimulus markers to LabRecorder for synchronized XDF recording.</w:t>
+        <w:t>Built a Python ingestion workflow combining EEG streams and event markers in XDF; automated recording startup through service discovery, readiness checks, and background tasks.</w:t>
       </w:r>
     </w:p>
     <w:p>
@@ -124,7 +124,7 @@
         <w:pStyle w:val="ListBullet"/>
       </w:pPr>
       <w:r>
-        <w:t>Transformed XDF sessions into labelled CSV datasets; recorded selected streams, channel indices, sample rate, reference, filters, and exported sample counts in preprocessing manifests.</w:t>
+        <w:t>Created structured CSV datasets with timestamps, session/trial identifiers, labels, and eight channel fields; exported JSON manifests linking source recordings, processing settings, and row counts.</w:t>
       </w:r>
     </w:p>
     <w:p>
@@ -132,7 +132,7 @@
         <w:pStyle w:val="ListBullet"/>
       </w:pPr>
       <w:r>
-        <w:t>Connected dataset preparation to classifier training, held-session-out metrics, model metadata, and quantized model exports for downstream software and hardware workflows.</w:t>
+        <w:t>Implemented required-column and empty-dataset checks, channel-count validation, and numeric conversion; preserved session, trial, and label boundaries when generating feature windows.</w:t>
       </w:r>
     </w:p>
     <w:p>
@@ -140,7 +140,7 @@
         <w:pStyle w:val="ListBullet"/>
       </w:pPr>
       <w:r>
-        <w:t>Integrated background startup tasks and status polling to expose acquisition failures; connected live classifier output to a browser game through a defined UDP packet contract.</w:t>
+        <w:t>Added automated tests for feature dimensions, finite preprocessing outputs, trial boundaries, and packet validation; connected batch preparation to training, held-session metrics, and model exports.</w:t>
       </w:r>
     </w:p>
     <w:p>
@@ -161,7 +161,7 @@
         <w:pStyle w:val="ListBullet"/>
       </w:pPr>
       <w:r>
-        <w:t>Developed launch and recording workflows around CGX EEG, behavioural tasks, LSL event markers, and LabRecorder, with session directories and diagnostic output.</w:t>
+        <w:t>Scripted acquisition orchestration across CGX EEG, behavioural tasks, LSL markers, and LabRecorder; organized recording outputs by session with diagnostic logs.</w:t>
       </w:r>
     </w:p>
     <w:p>
@@ -230,7 +230,7 @@
         <w:pStyle w:val="ListBullet"/>
       </w:pPr>
       <w:r>
-        <w:t>Integrate hardware acquisition with CGX/Sheeg recording tools, session metadata, preprocessing scripts, and live classification interfaces.</w:t>
+        <w:t>Build reusable preprocessing and integration scripts with schema checks, metadata manifests, automated tests, and live classification interfaces.</w:t>
       </w:r>
     </w:p>
     <w:p>

</xml_diff>

<commit_message>
Add ResearchTool SQL experience and server data storage to resume
</commit_message>
<xml_diff>
--- a/ats/ATS_Data_Engineering_Resume.docx
+++ b/ats/ATS_Data_Engineering_Resume.docx
@@ -12,7 +12,7 @@
     </w:p>
     <w:p>
       <w:r>
-        <w:t>DATA ENGINEERING | PYTHON PIPELINES | SCIENTIFIC AND SENSOR DATA</w:t>
+        <w:t>DATA ENGINEERING | PYTHON AND SQL | API AND SENSOR DATA PIPELINES</w:t>
       </w:r>
     </w:p>
     <w:p>
@@ -35,7 +35,7 @@
     </w:p>
     <w:p>
       <w:r>
-        <w:t>Research and embedded systems engineer focused on Python data pipelines, time-series acquisition, dataset preparation, and reproducible machine-learning workflows. Builds workflows that capture EEG and sensor streams, synchronize event labels, transform raw recordings into analysis-ready datasets, and export model artifacts. Combines practical hardware integration with data preprocessing, session metadata, diagnostic logging, and cybersecurity research.</w:t>
+        <w:t>Research and embedded systems engineer building Python and SQL data pipelines for sensor streams, scholarly APIs, and documents. Experience with SQLite relational storage, schema design, joins, indexes, upserts, metadata normalization, and dataset validation. Develops acquisition, server-based data storage, batch preprocessing, and document-indexing workflows that produce reusable datasets for analysis and machine learning.</w:t>
       </w:r>
     </w:p>
     <w:p>
@@ -51,10 +51,10 @@
         <w:rPr>
           <w:b/>
         </w:rPr>
-        <w:t xml:space="preserve">Programming and analysis: </w:t>
+        <w:t xml:space="preserve">Programming and databases: </w:t>
       </w:r>
       <w:r>
-        <w:t>Python, NumPy, Pandas, Bash, C, scikit-learn, PyTorch, TensorFlow/Keras.</w:t>
+        <w:t>Python, SQL, SQLite, table design, primary keys, joins, indexes, parameterized queries, upserts, NumPy, Pandas.</w:t>
       </w:r>
     </w:p>
     <w:p>
@@ -65,7 +65,7 @@
         <w:t xml:space="preserve">Data pipelines and storage: </w:t>
       </w:r>
       <w:r>
-        <w:t>Stream ingestion, batch ETL-style processing, structured CSV datasets, JSON metadata, XDF recordings, time-series alignment, feature engineering.</w:t>
+        <w:t>API and stream ingestion, batch processing, server-based file storage, SQLite persistence, CSV/JSON/XDF, metadata normalization, deduplication.</w:t>
       </w:r>
     </w:p>
     <w:p>
@@ -124,7 +124,7 @@
         <w:pStyle w:val="ListBullet"/>
       </w:pPr>
       <w:r>
-        <w:t>Created structured CSV datasets with timestamps, session/trial identifiers, labels, and eight channel fields; exported JSON manifests linking source recordings, processing settings, and row counts.</w:t>
+        <w:t>Saved acquired project data on a server; produced structured CSV datasets with timestamps, session/trial IDs, labels, and eight channels, plus JSON manifests linking source recordings and processing settings.</w:t>
       </w:r>
     </w:p>
     <w:p>
@@ -177,7 +177,12 @@
         <w:pStyle w:val="Heading2"/>
       </w:pPr>
       <w:r>
-        <w:t>EEG and fNIRS Platform | Sensor ingestion and logging</w:t>
+        <w:t>ResearchTool | API ingestion and SQL data platform</w:t>
+      </w:r>
+    </w:p>
+    <w:p>
+      <w:r>
+        <w:t>github.com/baazSingh13/researchTool</w:t>
       </w:r>
     </w:p>
     <w:p>
@@ -185,7 +190,7 @@
         <w:pStyle w:val="ListBullet"/>
       </w:pPr>
       <w:r>
-        <w:t>Developed Raspberry Pi acquisition software for 8-channel EEG and 8-channel analog acquisition, integrating ADS1299, ADS8688, and DAC8565 devices.</w:t>
+        <w:t>Built Python ingestion for scholarly metadata; normalized and deduplicated records into a persistent SQLite library with works, documents, chunks, and agent-run tables.</w:t>
       </w:r>
     </w:p>
     <w:p>
@@ -193,17 +198,21 @@
         <w:pStyle w:val="ListBullet"/>
       </w:pPr>
       <w:r>
-        <w:t>Coordinated shared SPI access using threading locks, GPIO/MUX sequencing, live visualization, and CSV logging to support concurrent acquisition and offline analysis.</w:t>
+        <w:t>Implemented parameterized SQL, primary-key upserts, work-key indexes, and document/chunk joins to support repeatable metadata loads and retrieval.</w:t>
       </w:r>
     </w:p>
     <w:p>
+      <w:pPr>
+        <w:pStyle w:val="ListBullet"/>
+      </w:pPr>
       <w:r>
-        <w:br w:type="page"/>
+        <w:t>Automated PDF extraction and chunk indexing; stored source paths, text/chunk counts, embeddings, and ingestion-run counts and errors for traceability.</w:t>
       </w:r>
     </w:p>
     <w:p>
       <w:pPr>
         <w:pStyle w:val="Heading1"/>
+        <w:pageBreakBefore/>
       </w:pPr>
       <w:r>
         <w:t>Professional Experience</w:t>

</xml_diff>